<commit_message>
Updates for Verizon and AWS skills
</commit_message>
<xml_diff>
--- a/CV_Andi_Lowe.docx
+++ b/CV_Andi_Lowe.docx
@@ -676,15 +676,14 @@
               <w:bottom w:w="15" w:type="dxa"/>
               <w:right w:w="100" w:type="dxa"/>
             </w:tcMar>
-            <w:hideMark/>
           </w:tcPr>
           <w:p>
             <w:pPr>
               <w:jc w:val="both"/>
               <w:rPr>
                 <w:rFonts w:eastAsia="Times New Roman"/>
-                <w:sz w:val="16"/>
-                <w:szCs w:val="16"/>
+                <w:sz w:val="20"/>
+                <w:szCs w:val="20"/>
               </w:rPr>
             </w:pPr>
           </w:p>
@@ -698,7 +697,6 @@
               <w:bottom w:w="15" w:type="dxa"/>
               <w:right w:w="100" w:type="dxa"/>
             </w:tcMar>
-            <w:hideMark/>
           </w:tcPr>
           <w:p>
             <w:pPr>
@@ -709,6 +707,8 @@
               </w:numPr>
               <w:jc w:val="both"/>
               <w:rPr>
+                <w:i/>
+                <w:iCs/>
                 <w:sz w:val="20"/>
                 <w:szCs w:val="20"/>
               </w:rPr>
@@ -716,21 +716,69 @@
             <w:hyperlink r:id="rId12" w:history="1">
               <w:r>
                 <w:rPr>
-                  <w:rStyle w:val="pplri9o-1"/>
-                  <w:color w:val="0000FF"/>
+                  <w:rStyle w:val="Hyperlink"/>
+                  <w:i/>
+                  <w:iCs/>
                   <w:sz w:val="20"/>
                   <w:szCs w:val="20"/>
-                  <w:u w:val="single"/>
                 </w:rPr>
-                <w:t>Texas Instruments</w:t>
+                <w:t>Verizon Connect</w:t>
               </w:r>
             </w:hyperlink>
-            <w:r>
-              <w:rPr>
-                <w:sz w:val="20"/>
-                <w:szCs w:val="20"/>
-              </w:rPr>
-              <w:t xml:space="preserve"> </w:t>
+          </w:p>
+        </w:tc>
+      </w:tr>
+      <w:tr>
+        <w:trPr>
+          <w:divId w:val="490028418"/>
+        </w:trPr>
+        <w:tc>
+          <w:tcPr>
+            <w:tcW w:w="471" w:type="pct"/>
+            <w:tcMar>
+              <w:top w:w="15" w:type="dxa"/>
+              <w:left w:w="100" w:type="dxa"/>
+              <w:bottom w:w="15" w:type="dxa"/>
+              <w:right w:w="100" w:type="dxa"/>
+            </w:tcMar>
+          </w:tcPr>
+          <w:p>
+            <w:pPr>
+              <w:jc w:val="both"/>
+              <w:rPr>
+                <w:rFonts w:eastAsia="Times New Roman"/>
+                <w:sz w:val="16"/>
+                <w:szCs w:val="16"/>
+              </w:rPr>
+            </w:pPr>
+          </w:p>
+        </w:tc>
+        <w:tc>
+          <w:tcPr>
+            <w:tcW w:w="4529" w:type="pct"/>
+            <w:tcMar>
+              <w:top w:w="15" w:type="dxa"/>
+              <w:left w:w="100" w:type="dxa"/>
+              <w:bottom w:w="15" w:type="dxa"/>
+              <w:right w:w="100" w:type="dxa"/>
+            </w:tcMar>
+          </w:tcPr>
+          <w:p>
+            <w:pPr>
+              <w:pStyle w:val="noindent"/>
+              <w:ind w:left="720"/>
+              <w:jc w:val="both"/>
+              <w:rPr>
+                <w:sz w:val="20"/>
+                <w:szCs w:val="20"/>
+              </w:rPr>
+            </w:pPr>
+            <w:r>
+              <w:rPr>
+                <w:sz w:val="20"/>
+                <w:szCs w:val="20"/>
+              </w:rPr>
+              <w:t>Developed machine learning models for predictive maintenance of GPS fleet tracking devices using AWS Sagemaker, Python, SQL, and AWS Redshift to identify non-reporting units.</w:t>
             </w:r>
           </w:p>
         </w:tc>
@@ -754,8 +802,9 @@
             <w:pPr>
               <w:jc w:val="both"/>
               <w:rPr>
-                <w:sz w:val="20"/>
-                <w:szCs w:val="20"/>
+                <w:rFonts w:eastAsia="Times New Roman"/>
+                <w:sz w:val="16"/>
+                <w:szCs w:val="16"/>
               </w:rPr>
             </w:pPr>
           </w:p>
@@ -773,59 +822,35 @@
           </w:tcPr>
           <w:p>
             <w:pPr>
-              <w:pStyle w:val="ListParagraph"/>
-              <w:jc w:val="both"/>
-              <w:rPr>
-                <w:rFonts w:eastAsia="Times New Roman"/>
-                <w:sz w:val="20"/>
-                <w:szCs w:val="20"/>
-              </w:rPr>
-            </w:pPr>
-            <w:r>
-              <w:rPr>
-                <w:rFonts w:eastAsia="Times New Roman"/>
-                <w:sz w:val="20"/>
-                <w:szCs w:val="20"/>
-              </w:rPr>
-              <w:t xml:space="preserve">Helped develop a proof of concept for remote sensing using </w:t>
-            </w:r>
+              <w:pStyle w:val="noindent"/>
+              <w:numPr>
+                <w:ilvl w:val="0"/>
+                <w:numId w:val="4"/>
+              </w:numPr>
+              <w:jc w:val="both"/>
+              <w:rPr>
+                <w:sz w:val="20"/>
+                <w:szCs w:val="20"/>
+              </w:rPr>
+            </w:pPr>
             <w:hyperlink r:id="rId13" w:history="1">
               <w:r>
                 <w:rPr>
-                  <w:rStyle w:val="Hyperlink"/>
-                  <w:rFonts w:eastAsia="Times New Roman"/>
+                  <w:rStyle w:val="pplri9o-1"/>
+                  <w:color w:val="0000FF"/>
                   <w:sz w:val="20"/>
                   <w:szCs w:val="20"/>
+                  <w:u w:val="single"/>
                 </w:rPr>
-                <w:t>millimetre-wave radar technology</w:t>
+                <w:t>Texas Instruments</w:t>
               </w:r>
             </w:hyperlink>
             <w:r>
               <w:rPr>
-                <w:rFonts w:eastAsia="Times New Roman"/>
-                <w:sz w:val="20"/>
-                <w:szCs w:val="20"/>
-              </w:rPr>
-              <w:t xml:space="preserve">. Performed analysis and image processing with </w:t>
-            </w:r>
-            <w:hyperlink r:id="rId14" w:history="1">
-              <w:r>
-                <w:rPr>
-                  <w:rStyle w:val="Hyperlink"/>
-                  <w:rFonts w:eastAsia="Times New Roman"/>
-                  <w:sz w:val="20"/>
-                  <w:szCs w:val="20"/>
-                </w:rPr>
-                <w:t>OpenCV</w:t>
-              </w:r>
-            </w:hyperlink>
-            <w:r>
-              <w:rPr>
-                <w:rFonts w:eastAsia="Times New Roman"/>
-                <w:sz w:val="20"/>
-                <w:szCs w:val="20"/>
-              </w:rPr>
-              <w:t xml:space="preserve"> to support project decision-making.</w:t>
+                <w:sz w:val="20"/>
+                <w:szCs w:val="20"/>
+              </w:rPr>
+              <w:t xml:space="preserve"> </w:t>
             </w:r>
           </w:p>
         </w:tc>
@@ -849,9 +874,8 @@
             <w:pPr>
               <w:jc w:val="both"/>
               <w:rPr>
-                <w:rFonts w:eastAsia="Times New Roman"/>
-                <w:sz w:val="16"/>
-                <w:szCs w:val="16"/>
+                <w:sz w:val="20"/>
+                <w:szCs w:val="20"/>
               </w:rPr>
             </w:pPr>
           </w:p>
@@ -869,35 +893,59 @@
           </w:tcPr>
           <w:p>
             <w:pPr>
-              <w:pStyle w:val="noindent"/>
-              <w:numPr>
-                <w:ilvl w:val="0"/>
-                <w:numId w:val="4"/>
-              </w:numPr>
-              <w:jc w:val="both"/>
-              <w:rPr>
-                <w:sz w:val="20"/>
-                <w:szCs w:val="20"/>
-              </w:rPr>
-            </w:pPr>
+              <w:pStyle w:val="ListParagraph"/>
+              <w:jc w:val="both"/>
+              <w:rPr>
+                <w:rFonts w:eastAsia="Times New Roman"/>
+                <w:sz w:val="20"/>
+                <w:szCs w:val="20"/>
+              </w:rPr>
+            </w:pPr>
+            <w:r>
+              <w:rPr>
+                <w:rFonts w:eastAsia="Times New Roman"/>
+                <w:sz w:val="20"/>
+                <w:szCs w:val="20"/>
+              </w:rPr>
+              <w:t xml:space="preserve">Helped develop a proof of concept for remote sensing using </w:t>
+            </w:r>
+            <w:hyperlink r:id="rId14" w:history="1">
+              <w:r>
+                <w:rPr>
+                  <w:rStyle w:val="Hyperlink"/>
+                  <w:rFonts w:eastAsia="Times New Roman"/>
+                  <w:sz w:val="20"/>
+                  <w:szCs w:val="20"/>
+                </w:rPr>
+                <w:t>millimetre-wave radar technology</w:t>
+              </w:r>
+            </w:hyperlink>
+            <w:r>
+              <w:rPr>
+                <w:rFonts w:eastAsia="Times New Roman"/>
+                <w:sz w:val="20"/>
+                <w:szCs w:val="20"/>
+              </w:rPr>
+              <w:t xml:space="preserve">. Performed analysis and image processing with </w:t>
+            </w:r>
             <w:hyperlink r:id="rId15" w:history="1">
               <w:r>
                 <w:rPr>
-                  <w:rStyle w:val="pplri9o-1"/>
-                  <w:color w:val="0000FF"/>
+                  <w:rStyle w:val="Hyperlink"/>
+                  <w:rFonts w:eastAsia="Times New Roman"/>
                   <w:sz w:val="20"/>
                   <w:szCs w:val="20"/>
-                  <w:u w:val="single"/>
                 </w:rPr>
-                <w:t>Child Mind Institute</w:t>
+                <w:t>OpenCV</w:t>
               </w:r>
             </w:hyperlink>
             <w:r>
               <w:rPr>
-                <w:sz w:val="20"/>
-                <w:szCs w:val="20"/>
-              </w:rPr>
-              <w:t xml:space="preserve"> </w:t>
+                <w:rFonts w:eastAsia="Times New Roman"/>
+                <w:sz w:val="20"/>
+                <w:szCs w:val="20"/>
+              </w:rPr>
+              <w:t xml:space="preserve"> to support project decision-making.</w:t>
             </w:r>
           </w:p>
         </w:tc>
@@ -921,8 +969,9 @@
             <w:pPr>
               <w:jc w:val="both"/>
               <w:rPr>
-                <w:sz w:val="20"/>
-                <w:szCs w:val="20"/>
+                <w:rFonts w:eastAsia="Times New Roman"/>
+                <w:sz w:val="16"/>
+                <w:szCs w:val="16"/>
               </w:rPr>
             </w:pPr>
           </w:p>
@@ -940,53 +989,35 @@
           </w:tcPr>
           <w:p>
             <w:pPr>
-              <w:pStyle w:val="ListParagraph"/>
-              <w:jc w:val="both"/>
-              <w:rPr>
-                <w:rFonts w:eastAsia="Times New Roman"/>
-                <w:sz w:val="20"/>
-                <w:szCs w:val="20"/>
-              </w:rPr>
-            </w:pPr>
-            <w:r>
-              <w:rPr>
-                <w:rFonts w:eastAsia="Times New Roman"/>
-                <w:sz w:val="20"/>
-                <w:szCs w:val="20"/>
-              </w:rPr>
-              <w:t xml:space="preserve">Engineered a ML algorithm in Python with </w:t>
-            </w:r>
-            <w:r>
-              <w:rPr>
-                <w:rFonts w:eastAsia="Times New Roman"/>
-                <w:sz w:val="20"/>
-                <w:szCs w:val="20"/>
-              </w:rPr>
-              <w:t>S</w:t>
-            </w:r>
-            <w:r>
-              <w:rPr>
-                <w:rFonts w:eastAsia="Times New Roman"/>
-                <w:sz w:val="20"/>
-                <w:szCs w:val="20"/>
-              </w:rPr>
-              <w:t>cikit-</w:t>
-            </w:r>
-            <w:r>
-              <w:rPr>
-                <w:rFonts w:eastAsia="Times New Roman"/>
-                <w:sz w:val="20"/>
-                <w:szCs w:val="20"/>
-              </w:rPr>
-              <w:t>L</w:t>
-            </w:r>
-            <w:r>
-              <w:rPr>
-                <w:rFonts w:eastAsia="Times New Roman"/>
-                <w:sz w:val="20"/>
-                <w:szCs w:val="20"/>
-              </w:rPr>
-              <w:t>earn to detect and monitor body-focused repetitive behaviours such as hair-pulling (trichotillomania), skin-picking (excoriation), and nail biting (onychophagia), which can be physically dangerous, leading to hair loss, skin infections, and scarring. Contributed to the development of a wrist-worn monitoring device that enables healthcare professionals to effectively track treatment outcomes. Oversaw data collection methods and hardware choices. Proactively identified potential risks and issues beyond the data science scope, ensuring seamless project execution through effective communication with team members.</w:t>
+              <w:pStyle w:val="noindent"/>
+              <w:numPr>
+                <w:ilvl w:val="0"/>
+                <w:numId w:val="4"/>
+              </w:numPr>
+              <w:jc w:val="both"/>
+              <w:rPr>
+                <w:sz w:val="20"/>
+                <w:szCs w:val="20"/>
+              </w:rPr>
+            </w:pPr>
+            <w:hyperlink r:id="rId16" w:history="1">
+              <w:r>
+                <w:rPr>
+                  <w:rStyle w:val="pplri9o-1"/>
+                  <w:color w:val="0000FF"/>
+                  <w:sz w:val="20"/>
+                  <w:szCs w:val="20"/>
+                  <w:u w:val="single"/>
+                </w:rPr>
+                <w:t>Child Mind Institute</w:t>
+              </w:r>
+            </w:hyperlink>
+            <w:r>
+              <w:rPr>
+                <w:sz w:val="20"/>
+                <w:szCs w:val="20"/>
+              </w:rPr>
+              <w:t xml:space="preserve"> </w:t>
             </w:r>
           </w:p>
         </w:tc>
@@ -1010,9 +1041,8 @@
             <w:pPr>
               <w:jc w:val="both"/>
               <w:rPr>
-                <w:rFonts w:eastAsia="Times New Roman"/>
-                <w:sz w:val="16"/>
-                <w:szCs w:val="16"/>
+                <w:sz w:val="20"/>
+                <w:szCs w:val="20"/>
               </w:rPr>
             </w:pPr>
           </w:p>
@@ -1030,35 +1060,37 @@
           </w:tcPr>
           <w:p>
             <w:pPr>
-              <w:pStyle w:val="noindent"/>
-              <w:numPr>
-                <w:ilvl w:val="0"/>
-                <w:numId w:val="4"/>
-              </w:numPr>
-              <w:jc w:val="both"/>
-              <w:rPr>
-                <w:sz w:val="20"/>
-                <w:szCs w:val="20"/>
-              </w:rPr>
-            </w:pPr>
-            <w:hyperlink r:id="rId16" w:history="1">
-              <w:r>
-                <w:rPr>
-                  <w:rStyle w:val="pplri9o-1"/>
-                  <w:color w:val="0000FF"/>
-                  <w:sz w:val="20"/>
-                  <w:szCs w:val="20"/>
-                  <w:u w:val="single"/>
-                </w:rPr>
-                <w:t>Merck Sharp &amp; Dohme</w:t>
-              </w:r>
-            </w:hyperlink>
-            <w:r>
-              <w:rPr>
+              <w:pStyle w:val="ListParagraph"/>
+              <w:jc w:val="both"/>
+              <w:rPr>
+                <w:rFonts w:eastAsia="Times New Roman"/>
+                <w:sz w:val="20"/>
+                <w:szCs w:val="20"/>
+              </w:rPr>
+            </w:pPr>
+            <w:r>
+              <w:rPr>
+                <w:rFonts w:eastAsia="Times New Roman"/>
+                <w:sz w:val="20"/>
+                <w:szCs w:val="20"/>
+              </w:rPr>
+              <w:t>Engineered</w:t>
+            </w:r>
+            <w:r>
+              <w:rPr>
+                <w:rFonts w:eastAsia="Times New Roman"/>
                 <w:sz w:val="20"/>
                 <w:szCs w:val="20"/>
               </w:rPr>
               <w:t xml:space="preserve"> </w:t>
+            </w:r>
+            <w:r>
+              <w:rPr>
+                <w:rFonts w:eastAsia="Times New Roman"/>
+                <w:sz w:val="20"/>
+                <w:szCs w:val="20"/>
+              </w:rPr>
+              <w:t>a ML algorithm in Python with Scikit-Learn to detect and monitor harmful body-focused repetitive behaviours such as hair-pulling, skin-picking, and nail biting. Contributed to the development of a wrist-worn monitoring device that enables healthcare professionals to effectively track treatment outcomes. Oversaw data collection methods and hardware choices. Proactively identified potential risks and issues beyond the data science scope, ensuring seamless project execution through effective communication with team members.</w:t>
             </w:r>
           </w:p>
         </w:tc>
@@ -1082,8 +1114,9 @@
             <w:pPr>
               <w:jc w:val="both"/>
               <w:rPr>
-                <w:sz w:val="20"/>
-                <w:szCs w:val="20"/>
+                <w:rFonts w:eastAsia="Times New Roman"/>
+                <w:sz w:val="16"/>
+                <w:szCs w:val="16"/>
               </w:rPr>
             </w:pPr>
           </w:p>
@@ -1101,21 +1134,35 @@
           </w:tcPr>
           <w:p>
             <w:pPr>
-              <w:pStyle w:val="ListParagraph"/>
-              <w:jc w:val="both"/>
-              <w:rPr>
-                <w:rFonts w:eastAsia="Times New Roman"/>
-                <w:sz w:val="20"/>
-                <w:szCs w:val="20"/>
-              </w:rPr>
-            </w:pPr>
-            <w:r>
-              <w:rPr>
-                <w:rFonts w:eastAsia="Times New Roman"/>
-                <w:sz w:val="20"/>
-                <w:szCs w:val="20"/>
-              </w:rPr>
-              <w:t>Defined optimal features for an email marketing campaign using insights from the analysis of data captured with neuromarketing software.</w:t>
+              <w:pStyle w:val="noindent"/>
+              <w:numPr>
+                <w:ilvl w:val="0"/>
+                <w:numId w:val="4"/>
+              </w:numPr>
+              <w:jc w:val="both"/>
+              <w:rPr>
+                <w:sz w:val="20"/>
+                <w:szCs w:val="20"/>
+              </w:rPr>
+            </w:pPr>
+            <w:hyperlink r:id="rId17" w:history="1">
+              <w:r>
+                <w:rPr>
+                  <w:rStyle w:val="pplri9o-1"/>
+                  <w:color w:val="0000FF"/>
+                  <w:sz w:val="20"/>
+                  <w:szCs w:val="20"/>
+                  <w:u w:val="single"/>
+                </w:rPr>
+                <w:t>Merck Sharp &amp; Dohme</w:t>
+              </w:r>
+            </w:hyperlink>
+            <w:r>
+              <w:rPr>
+                <w:sz w:val="20"/>
+                <w:szCs w:val="20"/>
+              </w:rPr>
+              <w:t xml:space="preserve"> </w:t>
             </w:r>
           </w:p>
         </w:tc>
@@ -1139,9 +1186,8 @@
             <w:pPr>
               <w:jc w:val="both"/>
               <w:rPr>
-                <w:rFonts w:eastAsia="Times New Roman"/>
-                <w:sz w:val="16"/>
-                <w:szCs w:val="16"/>
+                <w:sz w:val="20"/>
+                <w:szCs w:val="20"/>
               </w:rPr>
             </w:pPr>
           </w:p>
@@ -1159,35 +1205,29 @@
           </w:tcPr>
           <w:p>
             <w:pPr>
-              <w:pStyle w:val="noindent"/>
-              <w:numPr>
-                <w:ilvl w:val="0"/>
-                <w:numId w:val="4"/>
-              </w:numPr>
-              <w:jc w:val="both"/>
-              <w:rPr>
-                <w:sz w:val="20"/>
-                <w:szCs w:val="20"/>
-              </w:rPr>
-            </w:pPr>
-            <w:hyperlink r:id="rId17" w:history="1">
-              <w:r>
-                <w:rPr>
-                  <w:rStyle w:val="pplri9o-1"/>
-                  <w:color w:val="0000FF"/>
-                  <w:sz w:val="20"/>
-                  <w:szCs w:val="20"/>
-                  <w:u w:val="single"/>
-                </w:rPr>
-                <w:t>London Stock Exchange Group</w:t>
-              </w:r>
-            </w:hyperlink>
-            <w:r>
-              <w:rPr>
-                <w:sz w:val="20"/>
-                <w:szCs w:val="20"/>
-              </w:rPr>
-              <w:t xml:space="preserve"> </w:t>
+              <w:pStyle w:val="ListParagraph"/>
+              <w:jc w:val="both"/>
+              <w:rPr>
+                <w:rFonts w:eastAsia="Times New Roman"/>
+                <w:sz w:val="20"/>
+                <w:szCs w:val="20"/>
+              </w:rPr>
+            </w:pPr>
+            <w:r>
+              <w:rPr>
+                <w:rFonts w:eastAsia="Times New Roman"/>
+                <w:sz w:val="20"/>
+                <w:szCs w:val="20"/>
+              </w:rPr>
+              <w:t>I</w:t>
+            </w:r>
+            <w:r>
+              <w:rPr>
+                <w:rFonts w:eastAsia="Times New Roman"/>
+                <w:sz w:val="20"/>
+                <w:szCs w:val="20"/>
+              </w:rPr>
+              <w:t>dentified key features for an email marketing campaign by analysing neuromarketing data in Python.</w:t>
             </w:r>
           </w:p>
         </w:tc>
@@ -1211,8 +1251,9 @@
             <w:pPr>
               <w:jc w:val="both"/>
               <w:rPr>
-                <w:sz w:val="20"/>
-                <w:szCs w:val="20"/>
+                <w:rFonts w:eastAsia="Times New Roman"/>
+                <w:sz w:val="16"/>
+                <w:szCs w:val="16"/>
               </w:rPr>
             </w:pPr>
           </w:p>
@@ -1230,57 +1271,35 @@
           </w:tcPr>
           <w:p>
             <w:pPr>
-              <w:pStyle w:val="ListParagraph"/>
-              <w:jc w:val="both"/>
-              <w:rPr>
-                <w:rFonts w:eastAsia="Times New Roman"/>
-                <w:sz w:val="20"/>
-                <w:szCs w:val="20"/>
-              </w:rPr>
-            </w:pPr>
-            <w:r>
-              <w:rPr>
-                <w:rFonts w:eastAsia="Times New Roman"/>
-                <w:sz w:val="20"/>
-                <w:szCs w:val="20"/>
-              </w:rPr>
-              <w:t xml:space="preserve">Devised, developed, and maintained software in R and Python to anonymise Personal Identifiable Information (PII) data, aligning with </w:t>
-            </w:r>
+              <w:pStyle w:val="noindent"/>
+              <w:numPr>
+                <w:ilvl w:val="0"/>
+                <w:numId w:val="4"/>
+              </w:numPr>
+              <w:jc w:val="both"/>
+              <w:rPr>
+                <w:sz w:val="20"/>
+                <w:szCs w:val="20"/>
+              </w:rPr>
+            </w:pPr>
             <w:hyperlink r:id="rId18" w:history="1">
               <w:r>
                 <w:rPr>
-                  <w:rStyle w:val="Hyperlink"/>
-                  <w:rFonts w:eastAsia="Times New Roman"/>
+                  <w:rStyle w:val="pplri9o-1"/>
+                  <w:color w:val="0000FF"/>
                   <w:sz w:val="20"/>
                   <w:szCs w:val="20"/>
+                  <w:u w:val="single"/>
                 </w:rPr>
-                <w:t>EU GDPR data protection and privacy laws</w:t>
+                <w:t>London Stock Exchange Group</w:t>
               </w:r>
             </w:hyperlink>
             <w:r>
               <w:rPr>
-                <w:rFonts w:eastAsia="Times New Roman"/>
-                <w:sz w:val="20"/>
-                <w:szCs w:val="20"/>
-              </w:rPr>
-              <w:t xml:space="preserve">. This initiative safeguarded a critical </w:t>
-            </w:r>
-            <w:r>
-              <w:rPr>
-                <w:rStyle w:val="pplr9c-"/>
-                <w:rFonts w:eastAsia="Times New Roman"/>
-                <w:sz w:val="20"/>
-                <w:szCs w:val="20"/>
-              </w:rPr>
-              <w:t>$</w:t>
-            </w:r>
-            <w:r>
-              <w:rPr>
-                <w:rFonts w:eastAsia="Times New Roman"/>
-                <w:sz w:val="20"/>
-                <w:szCs w:val="20"/>
-              </w:rPr>
-              <w:t>250 million per annum revenue stream for the client. The cloud-hosted and dockerised software analyses the data and uses ML to generate a synthetic dataset that is structurally and statistically analogous but with robust privacy protections for use in non-production environments. Instituted best practice guidelines to aid the client in meeting GDPR commitments. Provided practical guidance that is backed by science on digital carbon footprint mitigation.</w:t>
+                <w:sz w:val="20"/>
+                <w:szCs w:val="20"/>
+              </w:rPr>
+              <w:t xml:space="preserve"> </w:t>
             </w:r>
           </w:p>
         </w:tc>
@@ -1304,9 +1323,8 @@
             <w:pPr>
               <w:jc w:val="both"/>
               <w:rPr>
-                <w:rFonts w:eastAsia="Times New Roman"/>
-                <w:sz w:val="16"/>
-                <w:szCs w:val="16"/>
+                <w:sz w:val="20"/>
+                <w:szCs w:val="20"/>
               </w:rPr>
             </w:pPr>
           </w:p>
@@ -1324,35 +1342,65 @@
           </w:tcPr>
           <w:p>
             <w:pPr>
-              <w:pStyle w:val="noindent"/>
-              <w:numPr>
-                <w:ilvl w:val="0"/>
-                <w:numId w:val="4"/>
-              </w:numPr>
-              <w:jc w:val="both"/>
-              <w:rPr>
-                <w:sz w:val="20"/>
-                <w:szCs w:val="20"/>
-              </w:rPr>
-            </w:pPr>
+              <w:pStyle w:val="ListParagraph"/>
+              <w:jc w:val="both"/>
+              <w:rPr>
+                <w:rFonts w:eastAsia="Times New Roman"/>
+                <w:sz w:val="20"/>
+                <w:szCs w:val="20"/>
+              </w:rPr>
+            </w:pPr>
+            <w:r>
+              <w:rPr>
+                <w:rFonts w:eastAsia="Times New Roman"/>
+                <w:sz w:val="20"/>
+                <w:szCs w:val="20"/>
+              </w:rPr>
+              <w:t xml:space="preserve">Devised, developed, and maintained software in R and Python to anonymise Personal Identifiable Information (PII) data, aligning with </w:t>
+            </w:r>
             <w:hyperlink r:id="rId19" w:history="1">
               <w:r>
                 <w:rPr>
-                  <w:rStyle w:val="pplri9o-1"/>
-                  <w:color w:val="0000FF"/>
+                  <w:rStyle w:val="Hyperlink"/>
+                  <w:rFonts w:eastAsia="Times New Roman"/>
                   <w:sz w:val="20"/>
                   <w:szCs w:val="20"/>
-                  <w:u w:val="single"/>
                 </w:rPr>
-                <w:t>Bayer AG</w:t>
+                <w:t>EU GDPR data protection and privacy laws</w:t>
               </w:r>
             </w:hyperlink>
             <w:r>
               <w:rPr>
-                <w:sz w:val="20"/>
-                <w:szCs w:val="20"/>
-              </w:rPr>
-              <w:t xml:space="preserve"> </w:t>
+                <w:rFonts w:eastAsia="Times New Roman"/>
+                <w:sz w:val="20"/>
+                <w:szCs w:val="20"/>
+              </w:rPr>
+              <w:t xml:space="preserve">. This initiative safeguarded a critical </w:t>
+            </w:r>
+            <w:r>
+              <w:rPr>
+                <w:rStyle w:val="pplr9c-"/>
+                <w:rFonts w:eastAsia="Times New Roman"/>
+                <w:sz w:val="20"/>
+                <w:szCs w:val="20"/>
+              </w:rPr>
+              <w:t>$</w:t>
+            </w:r>
+            <w:r>
+              <w:rPr>
+                <w:rFonts w:eastAsia="Times New Roman"/>
+                <w:sz w:val="20"/>
+                <w:szCs w:val="20"/>
+              </w:rPr>
+              <w:t xml:space="preserve">250 million per annum revenue stream for the client. </w:t>
+            </w:r>
+            <w:r>
+              <w:rPr>
+                <w:rFonts w:eastAsia="Times New Roman"/>
+                <w:sz w:val="20"/>
+                <w:szCs w:val="20"/>
+              </w:rPr>
+              <w:t>The cloud-hosted and dockerised software uses ML to generate a synthetic dataset with robust privacy protections for use in non-production environments. Instituted best practice guidelines to aid the client in meeting GDPR commitments. Provided practical guidance, backed by science, on digital carbon footprint mitigation.</w:t>
             </w:r>
           </w:p>
         </w:tc>
@@ -1376,8 +1424,9 @@
             <w:pPr>
               <w:jc w:val="both"/>
               <w:rPr>
-                <w:sz w:val="20"/>
-                <w:szCs w:val="20"/>
+                <w:rFonts w:eastAsia="Times New Roman"/>
+                <w:sz w:val="16"/>
+                <w:szCs w:val="16"/>
               </w:rPr>
             </w:pPr>
           </w:p>
@@ -1395,44 +1444,36 @@
           </w:tcPr>
           <w:p>
             <w:pPr>
-              <w:pStyle w:val="ListParagraph"/>
-              <w:jc w:val="both"/>
-              <w:rPr>
-                <w:rFonts w:eastAsia="Times New Roman"/>
-                <w:sz w:val="20"/>
-                <w:szCs w:val="20"/>
-              </w:rPr>
-            </w:pPr>
-            <w:r>
-              <w:rPr>
-                <w:rFonts w:eastAsia="Times New Roman"/>
-                <w:sz w:val="20"/>
-                <w:szCs w:val="20"/>
-              </w:rPr>
-              <w:t>Built extract, transform, and load (ETL) processes using KNIME for automated Excel financial report generation. Reduced report generation time from over 24 hours to under 2 hours.</w:t>
-            </w:r>
-          </w:p>
-          <w:p>
-            <w:pPr>
-              <w:pStyle w:val="ListParagraph"/>
-              <w:jc w:val="both"/>
-              <w:rPr>
-                <w:rFonts w:eastAsia="Times New Roman"/>
-                <w:sz w:val="20"/>
-                <w:szCs w:val="20"/>
-              </w:rPr>
-            </w:pPr>
-          </w:p>
-          <w:p>
-            <w:pPr>
-              <w:pStyle w:val="ListParagraph"/>
-              <w:jc w:val="both"/>
-              <w:rPr>
-                <w:rFonts w:eastAsia="Times New Roman"/>
-                <w:sz w:val="20"/>
-                <w:szCs w:val="20"/>
-              </w:rPr>
-            </w:pPr>
+              <w:pStyle w:val="noindent"/>
+              <w:numPr>
+                <w:ilvl w:val="0"/>
+                <w:numId w:val="4"/>
+              </w:numPr>
+              <w:jc w:val="both"/>
+              <w:rPr>
+                <w:sz w:val="20"/>
+                <w:szCs w:val="20"/>
+              </w:rPr>
+            </w:pPr>
+            <w:hyperlink r:id="rId20" w:history="1">
+              <w:r>
+                <w:rPr>
+                  <w:rStyle w:val="pplri9o-1"/>
+                  <w:color w:val="0000FF"/>
+                  <w:sz w:val="20"/>
+                  <w:szCs w:val="20"/>
+                  <w:u w:val="single"/>
+                </w:rPr>
+                <w:t>Bayer AG</w:t>
+              </w:r>
+            </w:hyperlink>
+            <w:r>
+              <w:rPr>
+                <w:sz w:val="20"/>
+                <w:szCs w:val="20"/>
+              </w:rPr>
+              <w:t xml:space="preserve"> </w:t>
+            </w:r>
           </w:p>
         </w:tc>
       </w:tr>
@@ -1453,34 +1494,12 @@
           </w:tcPr>
           <w:p>
             <w:pPr>
-              <w:pStyle w:val="noindent"/>
-              <w:jc w:val="both"/>
-              <w:rPr>
-                <w:sz w:val="20"/>
-                <w:szCs w:val="20"/>
-              </w:rPr>
-            </w:pPr>
-            <w:r>
-              <w:rPr>
-                <w:sz w:val="20"/>
-                <w:szCs w:val="20"/>
-              </w:rPr>
-              <w:t>2013–</w:t>
-            </w:r>
-            <w:r>
-              <w:rPr>
-                <w:sz w:val="20"/>
-                <w:szCs w:val="20"/>
-              </w:rPr>
-              <w:t xml:space="preserve">2017 </w:t>
-            </w:r>
-            <w:r>
-              <w:rPr>
-                <w:sz w:val="20"/>
-                <w:szCs w:val="20"/>
-              </w:rPr>
-              <w:t xml:space="preserve"> </w:t>
-            </w:r>
+              <w:jc w:val="both"/>
+              <w:rPr>
+                <w:sz w:val="20"/>
+                <w:szCs w:val="20"/>
+              </w:rPr>
+            </w:pPr>
           </w:p>
         </w:tc>
         <w:tc>
@@ -1496,6 +1515,64 @@
           </w:tcPr>
           <w:p>
             <w:pPr>
+              <w:pStyle w:val="ListParagraph"/>
+              <w:jc w:val="both"/>
+              <w:rPr>
+                <w:rFonts w:eastAsia="Times New Roman"/>
+                <w:sz w:val="20"/>
+                <w:szCs w:val="20"/>
+              </w:rPr>
+            </w:pPr>
+            <w:r>
+              <w:rPr>
+                <w:rFonts w:eastAsia="Times New Roman"/>
+                <w:sz w:val="20"/>
+                <w:szCs w:val="20"/>
+              </w:rPr>
+              <w:t>Built extract, transform, and load (ETL) processes using KNIME for automated Excel financial report generation. Reduced report generation time from over 24 hours to under 2 hours.</w:t>
+            </w:r>
+          </w:p>
+          <w:p>
+            <w:pPr>
+              <w:pStyle w:val="ListParagraph"/>
+              <w:jc w:val="both"/>
+              <w:rPr>
+                <w:rFonts w:eastAsia="Times New Roman"/>
+                <w:sz w:val="20"/>
+                <w:szCs w:val="20"/>
+              </w:rPr>
+            </w:pPr>
+          </w:p>
+          <w:p>
+            <w:pPr>
+              <w:pStyle w:val="ListParagraph"/>
+              <w:jc w:val="both"/>
+              <w:rPr>
+                <w:rFonts w:eastAsia="Times New Roman"/>
+                <w:sz w:val="20"/>
+                <w:szCs w:val="20"/>
+              </w:rPr>
+            </w:pPr>
+          </w:p>
+        </w:tc>
+      </w:tr>
+      <w:tr>
+        <w:trPr>
+          <w:divId w:val="490028418"/>
+        </w:trPr>
+        <w:tc>
+          <w:tcPr>
+            <w:tcW w:w="471" w:type="pct"/>
+            <w:tcMar>
+              <w:top w:w="15" w:type="dxa"/>
+              <w:left w:w="100" w:type="dxa"/>
+              <w:bottom w:w="15" w:type="dxa"/>
+              <w:right w:w="100" w:type="dxa"/>
+            </w:tcMar>
+            <w:hideMark/>
+          </w:tcPr>
+          <w:p>
+            <w:pPr>
               <w:pStyle w:val="noindent"/>
               <w:jc w:val="both"/>
               <w:rPr>
@@ -1505,13 +1582,56 @@
             </w:pPr>
             <w:r>
               <w:rPr>
+                <w:sz w:val="20"/>
+                <w:szCs w:val="20"/>
+              </w:rPr>
+              <w:t>2013–</w:t>
+            </w:r>
+            <w:r>
+              <w:rPr>
+                <w:sz w:val="20"/>
+                <w:szCs w:val="20"/>
+              </w:rPr>
+              <w:t xml:space="preserve">2017 </w:t>
+            </w:r>
+            <w:r>
+              <w:rPr>
+                <w:sz w:val="20"/>
+                <w:szCs w:val="20"/>
+              </w:rPr>
+              <w:t xml:space="preserve"> </w:t>
+            </w:r>
+          </w:p>
+        </w:tc>
+        <w:tc>
+          <w:tcPr>
+            <w:tcW w:w="4529" w:type="pct"/>
+            <w:tcMar>
+              <w:top w:w="15" w:type="dxa"/>
+              <w:left w:w="100" w:type="dxa"/>
+              <w:bottom w:w="15" w:type="dxa"/>
+              <w:right w:w="100" w:type="dxa"/>
+            </w:tcMar>
+            <w:hideMark/>
+          </w:tcPr>
+          <w:p>
+            <w:pPr>
+              <w:pStyle w:val="noindent"/>
+              <w:jc w:val="both"/>
+              <w:rPr>
+                <w:sz w:val="20"/>
+                <w:szCs w:val="20"/>
+              </w:rPr>
+            </w:pPr>
+            <w:r>
+              <w:rPr>
                 <w:rStyle w:val="pplb9o-1"/>
                 <w:sz w:val="20"/>
                 <w:szCs w:val="20"/>
               </w:rPr>
               <w:t xml:space="preserve">Research Fellow </w:t>
             </w:r>
-            <w:hyperlink r:id="rId20" w:history="1">
+            <w:hyperlink r:id="rId21" w:history="1">
               <w:r>
                 <w:rPr>
                   <w:rStyle w:val="pplri9o-1"/>
@@ -1580,7 +1700,7 @@
               </w:rPr>
               <w:t xml:space="preserve">for the </w:t>
             </w:r>
-            <w:hyperlink r:id="rId21" w:history="1">
+            <w:hyperlink r:id="rId22" w:history="1">
               <w:r>
                 <w:rPr>
                   <w:rStyle w:val="Hyperlink"/>
@@ -1597,7 +1717,7 @@
               </w:rPr>
               <w:t xml:space="preserve"> at </w:t>
             </w:r>
-            <w:hyperlink r:id="rId22" w:history="1">
+            <w:hyperlink r:id="rId23" w:history="1">
               <w:r>
                 <w:rPr>
                   <w:rStyle w:val="Hyperlink"/>
@@ -1712,7 +1832,7 @@
               </w:rPr>
               <w:t xml:space="preserve">Postdoctoral Fellow, Deputy Team Leader </w:t>
             </w:r>
-            <w:hyperlink r:id="rId23" w:history="1">
+            <w:hyperlink r:id="rId24" w:history="1">
               <w:r>
                 <w:rPr>
                   <w:rStyle w:val="pplri9o-1"/>
@@ -1891,7 +2011,7 @@
               </w:rPr>
               <w:t xml:space="preserve">Postdoctoral Fellow </w:t>
             </w:r>
-            <w:hyperlink r:id="rId24" w:history="1">
+            <w:hyperlink r:id="rId25" w:history="1">
               <w:r>
                 <w:rPr>
                   <w:rStyle w:val="pplri9o-1"/>
@@ -2045,14 +2165,6 @@
           <w:szCs w:val="20"/>
         </w:rPr>
       </w:pPr>
-    </w:p>
-    <w:p>
-      <w:pPr>
-        <w:divId w:val="490028418"/>
-      </w:pPr>
-      <w:r>
-        <w:br w:type="page"/>
-      </w:r>
     </w:p>
     <w:tbl>
       <w:tblPr>
@@ -2073,11 +2185,11 @@
         <w:trPr>
           <w:gridAfter w:val="1"/>
           <w:divId w:val="490028418"/>
-          <w:wAfter w:w="4320" w:type="pct"/>
+          <w:wAfter w:w="4319" w:type="pct"/>
         </w:trPr>
         <w:tc>
           <w:tcPr>
-            <w:tcW w:w="680" w:type="pct"/>
+            <w:tcW w:w="681" w:type="pct"/>
             <w:tcMar>
               <w:top w:w="15" w:type="dxa"/>
               <w:left w:w="100" w:type="dxa"/>
@@ -2095,13 +2207,19 @@
               </w:rPr>
             </w:pPr>
             <w:r>
+              <w:lastRenderedPageBreak/>
+              <w:br w:type="page"/>
+            </w:r>
+            <w:r>
+              <w:br/>
+            </w:r>
+            <w:r>
               <w:rPr>
                 <w:rStyle w:val="pplb9o-1"/>
                 <w:color w:val="3873B2"/>
                 <w:sz w:val="20"/>
                 <w:szCs w:val="20"/>
               </w:rPr>
-              <w:lastRenderedPageBreak/>
               <w:t>EDUCATION</w:t>
             </w:r>
           </w:p>
@@ -2148,7 +2266,7 @@
               </w:rPr>
               <w:t xml:space="preserve">PhD Particle Physics </w:t>
             </w:r>
-            <w:hyperlink r:id="rId25" w:history="1">
+            <w:hyperlink r:id="rId26" w:history="1">
               <w:r>
                 <w:rPr>
                   <w:rStyle w:val="pplri9o-1"/>
@@ -2182,7 +2300,7 @@
               </w:rPr>
               <w:t xml:space="preserve"> </w:t>
             </w:r>
-            <w:hyperlink r:id="rId26" w:history="1">
+            <w:hyperlink r:id="rId27" w:history="1">
               <w:r>
                 <w:rPr>
                   <w:rStyle w:val="pplri9o-1"/>
@@ -2304,7 +2422,7 @@
               </w:rPr>
               <w:t xml:space="preserve"> which can be written to permanent storage. Performed detailed time profiling of the core software and devised improvements that made it 8 times faster, thus meeting a critical requirement of the system. Ran analyses on petabyte-scale datasets using a distributed computing system. Wrote </w:t>
             </w:r>
-            <w:hyperlink r:id="rId27" w:history="1">
+            <w:hyperlink r:id="rId28" w:history="1">
               <w:r>
                 <w:rPr>
                   <w:rStyle w:val="Hyperlink"/>
@@ -2353,7 +2471,7 @@
               </w:rPr>
               <w:t xml:space="preserve">MSc Particle Physics </w:t>
             </w:r>
-            <w:hyperlink r:id="rId28" w:history="1">
+            <w:hyperlink r:id="rId29" w:history="1">
               <w:r>
                 <w:rPr>
                   <w:rStyle w:val="pplri9o-1"/>
@@ -2439,7 +2557,7 @@
               </w:rPr>
               <w:t xml:space="preserve"> decay channel with the </w:t>
             </w:r>
-            <w:hyperlink r:id="rId29" w:history="1">
+            <w:hyperlink r:id="rId30" w:history="1">
               <w:r>
                 <w:rPr>
                   <w:rStyle w:val="Hyperlink"/>
@@ -2503,7 +2621,7 @@
               </w:rPr>
               <w:t xml:space="preserve">BSc (Hons) Physics </w:t>
             </w:r>
-            <w:hyperlink r:id="rId30" w:history="1">
+            <w:hyperlink r:id="rId31" w:history="1">
               <w:r>
                 <w:rPr>
                   <w:rStyle w:val="pplri9o-1"/>
@@ -2887,7 +3005,7 @@
                 <w:szCs w:val="20"/>
               </w:rPr>
             </w:pPr>
-            <w:hyperlink r:id="rId31" w:history="1">
+            <w:hyperlink r:id="rId32" w:history="1">
               <w:r>
                 <w:rPr>
                   <w:rStyle w:val="pplb9o-1"/>
@@ -2979,7 +3097,7 @@
                 <w:szCs w:val="20"/>
               </w:rPr>
             </w:pPr>
-            <w:hyperlink r:id="rId32" w:history="1">
+            <w:hyperlink r:id="rId33" w:history="1">
               <w:r>
                 <w:rPr>
                   <w:rStyle w:val="Hyperlink"/>
@@ -3149,7 +3267,7 @@
               </w:rPr>
               <w:t>Python (</w:t>
             </w:r>
-            <w:hyperlink r:id="rId33" w:history="1">
+            <w:hyperlink r:id="rId34" w:history="1">
               <w:r>
                 <w:rPr>
                   <w:rStyle w:val="Hyperlink"/>
@@ -3166,7 +3284,7 @@
               </w:rPr>
               <w:t xml:space="preserve">, </w:t>
             </w:r>
-            <w:hyperlink r:id="rId34" w:history="1">
+            <w:hyperlink r:id="rId35" w:history="1">
               <w:r>
                 <w:rPr>
                   <w:rStyle w:val="Hyperlink"/>
@@ -3183,7 +3301,7 @@
               </w:rPr>
               <w:t xml:space="preserve">, </w:t>
             </w:r>
-            <w:hyperlink r:id="rId35" w:history="1">
+            <w:hyperlink r:id="rId36" w:history="1">
               <w:r>
                 <w:rPr>
                   <w:rStyle w:val="Hyperlink"/>
@@ -3200,7 +3318,7 @@
               </w:rPr>
               <w:t xml:space="preserve">, </w:t>
             </w:r>
-            <w:hyperlink r:id="rId36" w:history="1">
+            <w:hyperlink r:id="rId37" w:history="1">
               <w:r>
                 <w:rPr>
                   <w:rStyle w:val="Hyperlink"/>
@@ -3276,7 +3394,7 @@
               </w:rPr>
               <w:t xml:space="preserve"> </w:t>
             </w:r>
-            <w:hyperlink r:id="rId37" w:history="1">
+            <w:hyperlink r:id="rId38" w:history="1">
               <w:r>
                 <w:rPr>
                   <w:rStyle w:val="Hyperlink"/>
@@ -3304,7 +3422,7 @@
               </w:rPr>
               <w:t xml:space="preserve"> </w:t>
             </w:r>
-            <w:hyperlink r:id="rId38" w:history="1">
+            <w:hyperlink r:id="rId39" w:history="1">
               <w:r>
                 <w:rPr>
                   <w:rStyle w:val="Hyperlink"/>
@@ -3321,7 +3439,7 @@
               </w:rPr>
               <w:t xml:space="preserve">, </w:t>
             </w:r>
-            <w:hyperlink r:id="rId39" w:history="1">
+            <w:hyperlink r:id="rId40" w:history="1">
               <w:r>
                 <w:rPr>
                   <w:rStyle w:val="Hyperlink"/>
@@ -3338,7 +3456,7 @@
               </w:rPr>
               <w:t xml:space="preserve">, </w:t>
             </w:r>
-            <w:hyperlink r:id="rId40" w:history="1">
+            <w:hyperlink r:id="rId41" w:history="1">
               <w:r>
                 <w:rPr>
                   <w:rStyle w:val="Hyperlink"/>
@@ -3355,7 +3473,7 @@
               </w:rPr>
               <w:t xml:space="preserve">, </w:t>
             </w:r>
-            <w:hyperlink r:id="rId41" w:history="1">
+            <w:hyperlink r:id="rId42" w:history="1">
               <w:r>
                 <w:rPr>
                   <w:rStyle w:val="pplr9t-"/>
@@ -3395,7 +3513,7 @@
               </w:rPr>
               <w:t xml:space="preserve">, </w:t>
             </w:r>
-            <w:hyperlink r:id="rId42" w:history="1">
+            <w:hyperlink r:id="rId43" w:history="1">
               <w:r>
                 <w:rPr>
                   <w:rStyle w:val="Hyperlink"/>
@@ -3412,7 +3530,7 @@
               </w:rPr>
               <w:t xml:space="preserve">, </w:t>
             </w:r>
-            <w:hyperlink r:id="rId43" w:history="1">
+            <w:hyperlink r:id="rId44" w:history="1">
               <w:r>
                 <w:rPr>
                   <w:rStyle w:val="Hyperlink"/>
@@ -3450,7 +3568,7 @@
               </w:rPr>
               <w:t xml:space="preserve">Data visualisation: </w:t>
             </w:r>
-            <w:hyperlink r:id="rId44" w:history="1">
+            <w:hyperlink r:id="rId45" w:history="1">
               <w:r>
                 <w:rPr>
                   <w:rStyle w:val="Hyperlink"/>
@@ -3467,7 +3585,7 @@
               </w:rPr>
               <w:t xml:space="preserve">, </w:t>
             </w:r>
-            <w:hyperlink r:id="rId45" w:history="1">
+            <w:hyperlink r:id="rId46" w:history="1">
               <w:r>
                 <w:rPr>
                   <w:rStyle w:val="Hyperlink"/>
@@ -3484,7 +3602,7 @@
               </w:rPr>
               <w:t xml:space="preserve">, TIBCO Spotfire, Tableau, </w:t>
             </w:r>
-            <w:hyperlink r:id="rId46" w:history="1">
+            <w:hyperlink r:id="rId47" w:history="1">
               <w:r>
                 <w:rPr>
                   <w:rStyle w:val="Hyperlink"/>
@@ -3522,7 +3640,7 @@
               </w:rPr>
               <w:t xml:space="preserve">Notebooks/Documentation: </w:t>
             </w:r>
-            <w:hyperlink r:id="rId47" w:history="1">
+            <w:hyperlink r:id="rId48" w:history="1">
               <w:r>
                 <w:rPr>
                   <w:rStyle w:val="Hyperlink"/>
@@ -3539,7 +3657,7 @@
               </w:rPr>
               <w:t xml:space="preserve">, </w:t>
             </w:r>
-            <w:hyperlink r:id="rId48" w:history="1">
+            <w:hyperlink r:id="rId49" w:history="1">
               <w:r>
                 <w:rPr>
                   <w:rStyle w:val="Hyperlink"/>
@@ -3556,7 +3674,7 @@
               </w:rPr>
               <w:t xml:space="preserve">, </w:t>
             </w:r>
-            <w:hyperlink r:id="rId49" w:history="1">
+            <w:hyperlink r:id="rId50" w:history="1">
               <w:r>
                 <w:rPr>
                   <w:rStyle w:val="Hyperlink"/>
@@ -3573,7 +3691,7 @@
               </w:rPr>
               <w:t xml:space="preserve">, LaTeX, </w:t>
             </w:r>
-            <w:hyperlink r:id="rId50" w:history="1">
+            <w:hyperlink r:id="rId51" w:history="1">
               <w:r>
                 <w:rPr>
                   <w:rStyle w:val="Hyperlink"/>
@@ -3611,7 +3729,7 @@
               </w:rPr>
               <w:t xml:space="preserve">Software development: </w:t>
             </w:r>
-            <w:hyperlink r:id="rId51" w:history="1">
+            <w:hyperlink r:id="rId52" w:history="1">
               <w:r>
                 <w:rPr>
                   <w:rStyle w:val="Hyperlink"/>
@@ -3628,7 +3746,7 @@
               </w:rPr>
               <w:t xml:space="preserve">, Git/GitHub/GitLab, </w:t>
             </w:r>
-            <w:hyperlink r:id="rId52" w:history="1">
+            <w:hyperlink r:id="rId53" w:history="1">
               <w:r>
                 <w:rPr>
                   <w:rStyle w:val="Hyperlink"/>
@@ -3645,7 +3763,7 @@
               </w:rPr>
               <w:t xml:space="preserve">, </w:t>
             </w:r>
-            <w:hyperlink r:id="rId53" w:history="1">
+            <w:hyperlink r:id="rId54" w:history="1">
               <w:r>
                 <w:rPr>
                   <w:rStyle w:val="Hyperlink"/>
@@ -3662,7 +3780,7 @@
               </w:rPr>
               <w:t xml:space="preserve">, </w:t>
             </w:r>
-            <w:hyperlink r:id="rId54" w:history="1">
+            <w:hyperlink r:id="rId55" w:history="1">
               <w:r>
                 <w:rPr>
                   <w:rStyle w:val="Hyperlink"/>

</xml_diff>